<commit_message>
fit resume on one page with figma and design system in the supergood work
Co-Authored-By: Claude Opus 5.5 <noreply@anthropic.com>
</commit_message>
<xml_diff>
--- a/public/resume/igor-kupchinenko-product-designer-resume-ru.docx
+++ b/public/resume/igor-kupchinenko-product-designer-resume-ru.docx
@@ -15,7 +15,7 @@
         <w:pStyle w:val="Subtitle"/>
       </w:pPr>
       <w:r>
-        <w:t>ПРОДУКТОВЫЙ ДИЗАЙНЕР (JUNIOR) · B2C · ИССЛЕДОВАНИЯ И ИНТЕРФЕЙСЫ</w:t>
+        <w:t>ПРОДУКТОВЫЙ ДИЗАЙНЕР (JUNIOR, UX/UI) · B2C · ИССЛЕДОВАНИЯ И ИНТЕРФЕЙСЫ</w:t>
       </w:r>
     </w:p>
     <w:p>
@@ -118,7 +118,7 @@
           <w:rPr>
             <w:rFonts w:ascii="Arial" w:hAnsi="Arial" w:cs="Arial"/>
             <w:color w:val="222222"/>
-            <w:sz w:val="21"/>
+            <w:sz w:val="20"/>
             <w:u w:val="single"/>
             <w:b/>
           </w:rPr>
@@ -133,7 +133,7 @@
       </w:pPr>
       <w:r>
         <w:rPr>
-          <w:sz w:val="19"/>
+          <w:sz w:val="18"/>
         </w:rPr>
         <w:t>Продуктовый дизайнер / мобильный разработчик, приложение доставки еды | август 2023 - июль 2024</w:t>
       </w:r>
@@ -147,7 +147,7 @@
       <w:r>
         <w:t>•</w:t>
         <w:tab/>
-        <w:t>Единственный дизайнер и разработчик: отвечал за заказ целиком и работал напрямую с бизнесом. В отзывах сомневались и в приложении, и в цене еды: разобрал около 150 отзывов, понаблюдал и поговорил с 10 людьми, заказывавшими на работе.</w:t>
+        <w:t>Единственный дизайнер и разработчик: отвечал за заказ целиком и работал напрямую со стейкхолдерами бизнеса. В отзывах сомневались и в приложении, и в цене еды: разобрал около 150 отзывов, понаблюдал и поговорил с 10 людьми, заказывавшими на работе.</w:t>
       </w:r>
     </w:p>
     <w:p>
@@ -183,7 +183,7 @@
       <w:r>
         <w:t>•</w:t>
         <w:tab/>
-        <w:t>Пересобрал отдельные приложения для iOS и Android в одно на Flutter за 11 месяцев, без передачи макетов, на своей дизайн-системе со светлой и тёмной темами: меню, корзина, оплата с 3DS, карты, отслеживание, лояльность. Рейтинг вырос с 3,1 до 3,7, новые отзывы хвалили приложение.</w:t>
+        <w:t>Спроектировал все экраны в Figma (auto layout, компоненты, варианты, переменные, прототипы) на своей дизайн-системе со светлой и тёмной темами и пересобрал по ней приложения iOS и Android в одно на Flutter за 11 месяцев, без передачи макетов: меню, корзина, оплата с 3DS, карты, отслеживание, лояльность. Рейтинг вырос с 3,1 до 3,7; новые отзывы хвалили приложение.</w:t>
       </w:r>
     </w:p>
     <w:p>
@@ -201,7 +201,7 @@
       </w:pPr>
       <w:r>
         <w:rPr>
-          <w:sz w:val="19"/>
+          <w:sz w:val="18"/>
         </w:rPr>
         <w:t>Гейм-дизайнер / разработчик прототипов, казуальные мобильные игры | апрель 2023 - август 2023</w:t>
       </w:r>
@@ -221,25 +221,13 @@
     <w:p>
       <w:pPr>
         <w:pStyle w:val="ListBullet"/>
-        <w:keepNext/>
-        <w:keepLines/>
-      </w:pPr>
-      <w:r>
-        <w:t>•</w:t>
-        <w:tab/>
-        <w:t>Формировал стратегию через ограничения: препятствия и лимиты, которые заставляют игрока выбирать между подходами.</w:t>
-      </w:r>
-    </w:p>
-    <w:p>
-      <w:pPr>
-        <w:pStyle w:val="ListBullet"/>
         <w:keepNext w:val="0"/>
         <w:keepLines/>
       </w:pPr>
       <w:r>
         <w:t>•</w:t>
         <w:tab/>
-        <w:t>Плейтестил каждую сборку: сессии по 2-5 минут, удержание 1-го дня 27-30%, 7-го дня 4-10%. В работу взяли 2 прототипа из 7.</w:t>
+        <w:t>Плейтестил все сборки: сессии 2-5 минут, удержание D1 27-30%, D7 4-10%. Одобрили 2 прототипа из 7.</w:t>
       </w:r>
     </w:p>
     <w:p>
@@ -259,7 +247,7 @@
           <w:rPr>
             <w:rFonts w:ascii="Arial" w:hAnsi="Arial" w:cs="Arial"/>
             <w:color w:val="222222"/>
-            <w:sz w:val="21"/>
+            <w:sz w:val="20"/>
             <w:u w:val="single"/>
             <w:b/>
           </w:rPr>
@@ -274,7 +262,7 @@
       </w:pPr>
       <w:r>
         <w:rPr>
-          <w:sz w:val="19"/>
+          <w:sz w:val="18"/>
         </w:rPr>
         <w:t>Личный проект на macOS, собран с AI-агентами по моим спецификациям, релиз на GitHub | июль - август 2026</w:t>
       </w:r>
@@ -312,7 +300,7 @@
       <w:r>
         <w:t>•</w:t>
         <w:tab/>
-        <w:t>Три коллеги-разработчика два месяца сравнивают в нём версии приложений и приложения одного типа, например терминалы Ghostty, kitty и Alacritty.</w:t>
+        <w:t>Три коллеги-разработчика два месяца сравнивают в нём версии и аналоги приложений, например терминалы Ghostty, kitty и Alacritty.</w:t>
       </w:r>
     </w:p>
     <w:p>
@@ -324,7 +312,7 @@
           <w:rPr>
             <w:rFonts w:ascii="Arial" w:hAnsi="Arial" w:cs="Arial"/>
             <w:color w:val="222222"/>
-            <w:sz w:val="21"/>
+            <w:sz w:val="20"/>
             <w:u w:val="single"/>
             <w:b/>
           </w:rPr>
@@ -339,7 +327,7 @@
       </w:pPr>
       <w:r>
         <w:rPr>
-          <w:sz w:val="19"/>
+          <w:sz w:val="18"/>
         </w:rPr>
         <w:t>Продукт в Telegram для изучения китайского по исследованию дипломной работы | 2024</w:t>
       </w:r>
@@ -389,7 +377,7 @@
           <w:rPr>
             <w:rFonts w:ascii="Arial" w:hAnsi="Arial" w:cs="Arial"/>
             <w:color w:val="222222"/>
-            <w:sz w:val="21"/>
+            <w:sz w:val="20"/>
             <w:u w:val="single"/>
             <w:b/>
           </w:rPr>
@@ -404,7 +392,7 @@
       </w:pPr>
       <w:r>
         <w:rPr>
-          <w:sz w:val="19"/>
+          <w:sz w:val="18"/>
         </w:rPr>
         <w:t>Самостоятельный концепт, прототип в коде | 2026</w:t>
       </w:r>
@@ -418,7 +406,7 @@
       <w:r>
         <w:t>•</w:t>
         <w:tab/>
-        <w:t>Девять интервью и карта пути пользователя: шестеро не могли найти сохранённое, семеро уносили всё важное в Заметки, Notion или Карты, пятеро бросили сортировать. Поэтому первым сделал поиск в «Сохранённом», а не больше сортировки.</w:t>
+        <w:t>Девять интервью и CJM: шестеро не могли найти сохранённое, семеро уносили важное в Заметки, Notion или Карты, пятеро бросили сортировать. Поэтому начал с поиска в «Сохранённом», а не с сортировки.</w:t>
       </w:r>
     </w:p>
     <w:p>
@@ -452,7 +440,7 @@
         <w:rPr>
           <w:rFonts w:ascii="Arial" w:hAnsi="Arial" w:cs="Arial"/>
           <w:b w:val="0"/>
-          <w:sz w:val="19"/>
+          <w:sz w:val="18"/>
         </w:rPr>
         <w:t xml:space="preserve">  |  Разработчик ПО, контракт | июль 2024 - декабрь 2025</w:t>
       </w:r>
@@ -465,7 +453,7 @@
       <w:r>
         <w:t>•</w:t>
         <w:tab/>
-        <w:t>Разрабатывал сервисы оплаты и обработки заказов. Сократил обработку PDF-чеков с 6-10 с до 650 мс: извлекал текст напрямую, оставив OCR для изображений.</w:t>
+        <w:t>Разрабатывал сервисы оплаты и заказов; сократил обработку PDF-чеков с 6-10 с до 650 мс.</w:t>
       </w:r>
     </w:p>
     <w:p>
@@ -480,9 +468,9 @@
       <w:r>
         <w:t>Исследования: CustDev и глубинные интервью, контекстное исследование, сравнительное юзабилити-тестирование, анализ отзывов, плейтесты, job stories (JTBD), CJM, конкурентный анализ, синтез.</w:t>
         <w:br/>
-        <w:t>Дизайн: UX/UI, информационная архитектура, сценарии, вайрфреймы, прототипирование, дизайн-система, игровые циклы и прогрессия, моушн. Figma, Material Design, Apple HIG.</w:t>
+        <w:t>Дизайн: UX/UI, информационная архитектура, сценарии, вайрфреймы, hi-fi макеты, прототипирование, дизайн-системы, мобильный дизайн (iOS, Android), моушн. Figma, FigJam, Material Design, Apple HIG.</w:t>
         <w:br/>
-        <w:t>AI и код: AI-функции (подсказки, семантический поиск), разработка с AI-агентами (Claude Code, Codex). React, Flutter, HTML/CSS/JS, SwiftUI; Go, Python.</w:t>
+        <w:t>AI и код: семантический поиск, AI-подсказки, Claude Code, Codex; React, Flutter, HTML/CSS/JS, SwiftUI.</w:t>
       </w:r>
     </w:p>
     <w:p>
@@ -500,7 +488,7 @@
     </w:p>
     <w:sectPr>
       <w:pgSz w:w="11906" w:h="16838"/>
-      <w:pgMar w:top="624" w:right="907" w:bottom="624" w:left="907" w:header="720" w:footer="720" w:gutter="0"/>
+      <w:pgMar w:top="567" w:right="794" w:bottom="567" w:left="794" w:header="720" w:footer="720" w:gutter="0"/>
       <w:cols w:space="720"/>
       <w:docGrid w:linePitch="360"/>
     </w:sectPr>
@@ -872,12 +860,12 @@
     <w:qFormat/>
     <w:rsid w:val="00FC693F"/>
     <w:pPr>
-      <w:spacing w:line="250" w:lineRule="auto" w:after="60"/>
+      <w:spacing w:line="240" w:lineRule="auto" w:after="40"/>
     </w:pPr>
     <w:rPr>
       <w:rFonts w:ascii="Arial" w:hAnsi="Arial"/>
       <w:color w:val="222222"/>
-      <w:sz w:val="21"/>
+      <w:sz w:val="20"/>
     </w:rPr>
   </w:style>
   <w:style w:type="paragraph" w:styleId="Header">
@@ -935,7 +923,7 @@
     <w:pPr>
       <w:keepNext/>
       <w:keepLines/>
-      <w:spacing w:before="80" w:after="40"/>
+      <w:spacing w:before="60" w:after="40"/>
       <w:outlineLvl w:val="0"/>
     </w:pPr>
     <w:rPr>
@@ -943,7 +931,7 @@
       <w:b/>
       <w:bCs/>
       <w:color w:val="000000"/>
-      <w:sz w:val="21"/>
+      <w:sz w:val="20"/>
       <w:szCs w:val="28"/>
     </w:rPr>
   </w:style>
@@ -959,7 +947,7 @@
     <w:pPr>
       <w:keepNext/>
       <w:keepLines/>
-      <w:spacing w:before="80" w:after="20"/>
+      <w:spacing w:before="40" w:after="20"/>
       <w:outlineLvl w:val="1"/>
     </w:pPr>
     <w:rPr>
@@ -967,7 +955,7 @@
       <w:b/>
       <w:bCs/>
       <w:color w:val="000000"/>
-      <w:sz w:val="21"/>
+      <w:sz w:val="20"/>
       <w:szCs w:val="26"/>
     </w:rPr>
   </w:style>
@@ -1270,7 +1258,7 @@
       <w:iCs/>
       <w:color w:val="000000"/>
       <w:spacing w:val="15"/>
-      <w:sz w:val="20"/>
+      <w:sz w:val="19"/>
       <w:szCs w:val="24"/>
     </w:rPr>
   </w:style>
@@ -1406,14 +1394,14 @@
       <w:tabs>
         <w:tab w:pos="170" w:val="left"/>
       </w:tabs>
-      <w:spacing w:after="40"/>
+      <w:spacing w:after="30"/>
       <w:ind w:left="170" w:hanging="170"/>
       <w:contextualSpacing/>
     </w:pPr>
     <w:rPr>
       <w:rFonts w:ascii="Arial" w:hAnsi="Arial" w:cs="Arial" w:eastAsia="Arial"/>
       <w:color w:val="000000"/>
-      <w:sz w:val="21"/>
+      <w:sz w:val="20"/>
     </w:rPr>
   </w:style>
   <w:style w:type="paragraph" w:styleId="ListBullet2">

</xml_diff>